<commit_message>
update Waypoint & Gpx
</commit_message>
<xml_diff>
--- a/Project Documentation & MVP.docx
+++ b/Project Documentation & MVP.docx
@@ -610,7 +610,7 @@
         <w:jc w:val="both"/>
       </w:pPr>
       <w:r>
-        <w:t>Keputusan produk yang masih terbuka</w:t>
+        <w:t>Keputusan produk dan batasan yang disepakati</w:t>
       </w:r>
     </w:p>
     <w:p>
@@ -623,7 +623,7 @@
         </w:rPr>
       </w:pPr>
       <w:r>
-        <w:t>Cara menggambar rute: titik manual yang dihubungkan garis lurus, atau titik yang mengikuti jalur trail dan jalan melalui layanan routing.</w:t>
+        <w:t>Strategi menggambar rute telah tersedia sebagai pilihan: garis langsung antar titik kontrol atau routing jalan kaki melalui layanan publik. Hasil routing bergantung pada jaringan peta dan layanan yang tersedia.</w:t>
       </w:r>
     </w:p>
     <w:p>
@@ -636,7 +636,7 @@
         </w:rPr>
       </w:pPr>
       <w:r>
-        <w:t>Aplikasi atau smartwatch target pertama untuk pengujian kompatibilitas.</w:t>
+        <w:t>Aplikasi target uji impor GPX belum ditetapkan sebagai hasil proyek; pengguna akan menguji file pada Strava dan melaporkan hasilnya.</w:t>
       </w:r>
     </w:p>
     <w:p>
@@ -649,18 +649,18 @@
         </w:rPr>
       </w:pPr>
       <w:r>
-        <w:t>Apakah waypoint/checkpoint harus tampil di perangkat, atau cukup tersimpan di Ultra Planner pada tahap awal.</w:t>
-      </w:r>
-    </w:p>
-    <w:p>
-      <w:pPr>
-        <w:jc w:val="both"/>
-        <w:rPr>
-          <w:rFonts w:hint="eastAsia"/>
-        </w:rPr>
-      </w:pPr>
-      <w:r>
-        <w:t>Leaflet menampilkan peta dan geometri, tetapi mengikuti jaringan jalan atau trail memerlukan sumber data dan mekanisme routing tersendiri. Keputusan ini dibuat setelah kebutuhan rute manual dan platform target dibahas.</w:t>
+        <w:t>Waypoint manual dan checkpoint otomatis diekspor sebagai GPX waypoint. Dukungan untuk menampilkan waypoint berbeda-beda antar aplikasi dan masih menunggu uji pada Strava.</w:t>
+      </w:r>
+    </w:p>
+    <w:p>
+      <w:pPr>
+        <w:jc w:val="both"/>
+        <w:rPr>
+          <w:rFonts w:hint="eastAsia"/>
+        </w:rPr>
+      </w:pPr>
+      <w:r>
+        <w:t>Leaflet digunakan untuk peta. Routing jalan kaki memakai layanan routing terpisah dan hasilnya dapat berbeda sesuai data jalan/trail pada layanan tersebut.</w:t>
       </w:r>
     </w:p>
     <w:p>
@@ -1511,7 +1511,7 @@
         </w:rPr>
       </w:pPr>
       <w:r>
-        <w:t>Buat ekspor GPX standar dengan metadata nama rute dan koordinat yang valid.</w:t>
+        <w:t>Buat ekspor GPX standar dengan metadata nama rute, koordinat valid, serta elevasi hanya bila tersedia.</w:t>
       </w:r>
     </w:p>
     <w:p>
@@ -1524,7 +1524,7 @@
         </w:rPr>
       </w:pPr>
       <w:r>
-        <w:t>Sediakan unduhan file dan uji impor pada satu atau lebih aplikasi target yang dipilih.</w:t>
+        <w:t>Sediakan unduhan file dan catat hasil uji impor pada aplikasi target setelah pengujian dilakukan.</w:t>
       </w:r>
     </w:p>
     <w:p>
@@ -1537,7 +1537,7 @@
         </w:rPr>
       </w:pPr>
       <w:r>
-        <w:t>Laporkan keterbatasan waypoint dan metadata berdasarkan hasil uji platform.</w:t>
+        <w:t>Laporkan keterbatasan waypoint dan metadata berdasarkan hasil uji platform; jangan mengklaim kompatibilitas sebelum diuji.</w:t>
       </w:r>
     </w:p>
     <w:p>
@@ -1606,7 +1606,7 @@
         </w:rPr>
       </w:pPr>
       <w:r>
-        <w:t>Buat checkpoint otomatis, dengan interval awal 5 km dan titik finis.</w:t>
+        <w:t>Hitung checkpoint otomatis setiap 5 km dan pada finis saat detail rute atau ekspor diminta; interpolasikan lokasinya pada segmen track yang tersambung.</w:t>
       </w:r>
     </w:p>
     <w:p>
@@ -1619,7 +1619,7 @@
         </w:rPr>
       </w:pPr>
       <w:r>
-        <w:t>Tempatkan checkpoint dengan interpolasi di antara titik rute yang mengapit jarak target.</w:t>
+        <w:t>Hindari interpolasi melintasi celah antarsegmen track yang terputus.</w:t>
       </w:r>
     </w:p>
     <w:p>
@@ -1632,8 +1632,7 @@
         </w:rPr>
       </w:pPr>
       <w:r>
-        <w:lastRenderedPageBreak/>
-        <w:t>Izinkan waypoint manual seperti water refill, food stop, turnaround, exit point, dan pickup point.</w:t>
+        <w:t>Izinkan waypoint manual dengan tiga jenis yang saat ini didukung: Water station, Checkpoint, dan Food station. Waypoint disimpan pada tabel waypoints; pengguna dapat menambah, mengubah nama/jenis/catatan/lokasi, atau menghapusnya dari halaman edit rute.</w:t>
       </w:r>
     </w:p>
     <w:p>
@@ -1672,7 +1671,55 @@
         </w:rPr>
       </w:pPr>
       <w:r>
-        <w:t>Bedakan jarak hasil hitung dari metadata rute.</w:t>
+        <w:t>Hitung jarak kumulatif dari koordinat track, termasuk jarak tiap segmen tersambung. Jangan menganggap jarak hasil hitung sebagai metadata atau data GPS yang tercatat saat aktivitas.</w:t>
+      </w:r>
+    </w:p>
+    <w:p>
+      <w:pPr>
+        <w:pStyle w:val="Heading3"/>
+      </w:pPr>
+      <w:r>
+        <w:t>Status implementasi Fase 2 saat ini</w:t>
+      </w:r>
+    </w:p>
+    <w:p>
+      <w:pPr>
+        <w:pStyle w:val="ListBullet"/>
+      </w:pPr>
+      <w:r>
+        <w:t>Jarak lintasan dihitung dari koordinat track dan jarak kumulatif tiap titik disimpan. Perubahan geometri track juga memperbarui jarak waypoint manual.</w:t>
+      </w:r>
+    </w:p>
+    <w:p>
+      <w:pPr>
+        <w:pStyle w:val="ListBullet"/>
+      </w:pPr>
+      <w:r>
+        <w:t>Checkpoint otomatis dibuat setiap 5 km dan pada finis. Posisinya diinterpolasi di dalam segmen track tersambung; checkpoint turunan ini dihitung saat diperlukan dan tidak mempunyai rekaman database tersendiri.</w:t>
+      </w:r>
+    </w:p>
+    <w:p>
+      <w:pPr>
+        <w:pStyle w:val="ListBullet"/>
+      </w:pPr>
+      <w:r>
+        <w:t>Waypoint manual tersimpan di tabel waypoints dan dapat ditambah, diedit, dipindah pada peta, atau dihapus setelah rute tersimpan. Jenis yang aktif adalah Water station, Checkpoint, dan Food station.</w:t>
+      </w:r>
+    </w:p>
+    <w:p>
+      <w:pPr>
+        <w:pStyle w:val="ListBullet"/>
+      </w:pPr>
+      <w:r>
+        <w:t>Grafik serta ringkasan kenaikan dan penurunan memakai sampel estimasi terrain SRTM 30 m dari OpenTopoData. Nilai elevasi kosong tidak diisi dengan angka buatan.</w:t>
+      </w:r>
+    </w:p>
+    <w:p>
+      <w:pPr>
+        <w:pStyle w:val="ListBullet"/>
+      </w:pPr>
+      <w:r>
+        <w:t>Ekspor GPX berisi track, elevasi hanya jika tersedia, waypoint manual, dan checkpoint otomatis sebagai waypoint. Ekspor tidak menambahkan pace, waktu aktivitas, atau timestamp per titik yang tidak berasal dari rekaman aktivitas. Kompatibilitas impor Strava belum diverifikasi dan menunggu pengujian pengguna.</w:t>
       </w:r>
     </w:p>
     <w:p>
@@ -1962,299 +2009,71 @@
         </w:rPr>
       </w:pPr>
       <w:r>
-        <w:rPr>
-          <w:rFonts w:ascii="Consolas" w:hAnsi="Consolas"/>
-          <w:color w:val="2D3A32"/>
-          <w:sz w:val="17"/>
-        </w:rPr>
-        <w:lastRenderedPageBreak/>
         <w:t>app/</w:t>
-      </w:r>
-      <w:r>
-        <w:rPr>
-          <w:rFonts w:ascii="Consolas" w:hAnsi="Consolas"/>
-          <w:color w:val="2D3A32"/>
-          <w:sz w:val="17"/>
-        </w:rPr>
         <w:br/>
         <w:t xml:space="preserve">  Http/</w:t>
-      </w:r>
-      <w:r>
-        <w:rPr>
-          <w:rFonts w:ascii="Consolas" w:hAnsi="Consolas"/>
-          <w:color w:val="2D3A32"/>
-          <w:sz w:val="17"/>
-        </w:rPr>
         <w:br/>
         <w:t xml:space="preserve">    Controllers/</w:t>
-      </w:r>
-      <w:r>
-        <w:rPr>
-          <w:rFonts w:ascii="Consolas" w:hAnsi="Consolas"/>
-          <w:color w:val="2D3A32"/>
-          <w:sz w:val="17"/>
-        </w:rPr>
         <w:br/>
         <w:t xml:space="preserve">      DashboardController.php</w:t>
-      </w:r>
-      <w:r>
-        <w:rPr>
-          <w:rFonts w:ascii="Consolas" w:hAnsi="Consolas"/>
-          <w:color w:val="2D3A32"/>
-          <w:sz w:val="17"/>
-        </w:rPr>
         <w:br/>
         <w:t xml:space="preserve">      RouteController.php</w:t>
-      </w:r>
-      <w:r>
-        <w:rPr>
-          <w:rFonts w:ascii="Consolas" w:hAnsi="Consolas"/>
-          <w:color w:val="2D3A32"/>
-          <w:sz w:val="17"/>
-        </w:rPr>
         <w:br/>
-        <w:t xml:space="preserve">      GpxExportController.php</w:t>
-      </w:r>
-      <w:r>
-        <w:rPr>
-          <w:rFonts w:ascii="Consolas" w:hAnsi="Consolas"/>
-          <w:color w:val="2D3A32"/>
-          <w:sz w:val="17"/>
-        </w:rPr>
+        <w:t xml:space="preserve">      RouteWaypointController.php</w:t>
         <w:br/>
-        <w:t xml:space="preserve">    Requests/</w:t>
-      </w:r>
-      <w:r>
-        <w:rPr>
-          <w:rFonts w:ascii="Consolas" w:hAnsi="Consolas"/>
-          <w:color w:val="2D3A32"/>
-          <w:sz w:val="17"/>
-        </w:rPr>
+        <w:t xml:space="preserve">      RouteCheckpointController.php</w:t>
         <w:br/>
-        <w:t xml:space="preserve">      StoreRouteRequest.php</w:t>
-      </w:r>
-      <w:r>
-        <w:rPr>
-          <w:rFonts w:ascii="Consolas" w:hAnsi="Consolas"/>
-          <w:color w:val="2D3A32"/>
-          <w:sz w:val="17"/>
-        </w:rPr>
+        <w:t xml:space="preserve">      RouteGpxExportController.php</w:t>
         <w:br/>
-        <w:t xml:space="preserve">      UpdateRouteRequest.php</w:t>
-      </w:r>
-      <w:r>
-        <w:rPr>
-          <w:rFonts w:ascii="Consolas" w:hAnsi="Consolas"/>
-          <w:color w:val="2D3A32"/>
-          <w:sz w:val="17"/>
-        </w:rPr>
+        <w:t xml:space="preserve">      RoutePreviewController.php</w:t>
+        <w:br/>
+        <w:t xml:space="preserve">      ElevationPreviewController.php</w:t>
+        <w:br/>
+        <w:t xml:space="preserve">      LocationSearchController.php</w:t>
         <w:br/>
         <w:t xml:space="preserve">  Models/</w:t>
-      </w:r>
-      <w:r>
-        <w:rPr>
-          <w:rFonts w:ascii="Consolas" w:hAnsi="Consolas"/>
-          <w:color w:val="2D3A32"/>
-          <w:sz w:val="17"/>
-        </w:rPr>
         <w:br/>
         <w:t xml:space="preserve">    Route.php</w:t>
-      </w:r>
-      <w:r>
-        <w:rPr>
-          <w:rFonts w:ascii="Consolas" w:hAnsi="Consolas"/>
-          <w:color w:val="2D3A32"/>
-          <w:sz w:val="17"/>
-        </w:rPr>
+        <w:br/>
+        <w:t xml:space="preserve">    RouteControlPoint.php</w:t>
         <w:br/>
         <w:t xml:space="preserve">    RoutePoint.php</w:t>
-      </w:r>
-      <w:r>
-        <w:rPr>
-          <w:rFonts w:ascii="Consolas" w:hAnsi="Consolas"/>
-          <w:color w:val="2D3A32"/>
-          <w:sz w:val="17"/>
-        </w:rPr>
         <w:br/>
         <w:t xml:space="preserve">    Waypoint.php</w:t>
-      </w:r>
-      <w:r>
-        <w:rPr>
-          <w:rFonts w:ascii="Consolas" w:hAnsi="Consolas"/>
-          <w:color w:val="2D3A32"/>
-          <w:sz w:val="17"/>
-        </w:rPr>
-        <w:br/>
-        <w:t xml:space="preserve">    Checkpoint.php</w:t>
-      </w:r>
-      <w:r>
-        <w:rPr>
-          <w:rFonts w:ascii="Consolas" w:hAnsi="Consolas"/>
-          <w:color w:val="2D3A32"/>
-          <w:sz w:val="17"/>
-        </w:rPr>
         <w:br/>
         <w:t xml:space="preserve">  Services/</w:t>
-      </w:r>
-      <w:r>
-        <w:rPr>
-          <w:rFonts w:ascii="Consolas" w:hAnsi="Consolas"/>
-          <w:color w:val="2D3A32"/>
-          <w:sz w:val="17"/>
-        </w:rPr>
         <w:br/>
-        <w:t xml:space="preserve">    RouteAnalyzer.php</w:t>
-      </w:r>
-      <w:r>
-        <w:rPr>
-          <w:rFonts w:ascii="Consolas" w:hAnsi="Consolas"/>
-          <w:color w:val="2D3A32"/>
-          <w:sz w:val="17"/>
-        </w:rPr>
+        <w:t xml:space="preserve">    RouteGeometryService.php</w:t>
         <w:br/>
-        <w:t xml:space="preserve">    GpxExporter.php</w:t>
-      </w:r>
-      <w:r>
-        <w:rPr>
-          <w:rFonts w:ascii="Consolas" w:hAnsi="Consolas"/>
-          <w:color w:val="2D3A32"/>
-          <w:sz w:val="17"/>
-        </w:rPr>
+        <w:t xml:space="preserve">    CheckpointGenerator.php       (Fase 2, checkpoint otomatis turunan)</w:t>
         <w:br/>
-        <w:t xml:space="preserve">    CheckpointGenerator.php       (Fase 2)</w:t>
-      </w:r>
-      <w:r>
-        <w:rPr>
-          <w:rFonts w:ascii="Consolas" w:hAnsi="Consolas"/>
-          <w:color w:val="2D3A32"/>
-          <w:sz w:val="17"/>
-        </w:rPr>
+        <w:t xml:space="preserve">    ElevationProfileService.php   (Fase 2)</w:t>
         <w:br/>
         <w:t xml:space="preserve">    EtaCalculator.php             (Fase 3)</w:t>
-      </w:r>
-      <w:r>
-        <w:rPr>
-          <w:rFonts w:ascii="Consolas" w:hAnsi="Consolas"/>
-          <w:color w:val="2D3A32"/>
-          <w:sz w:val="17"/>
-        </w:rPr>
         <w:br/>
         <w:t xml:space="preserve">    FuelingPlanner.php            (Fase 4)</w:t>
-      </w:r>
-      <w:r>
-        <w:rPr>
-          <w:rFonts w:ascii="Consolas" w:hAnsi="Consolas"/>
-          <w:color w:val="2D3A32"/>
-          <w:sz w:val="17"/>
-        </w:rPr>
         <w:br/>
         <w:t>resources/</w:t>
-      </w:r>
-      <w:r>
-        <w:rPr>
-          <w:rFonts w:ascii="Consolas" w:hAnsi="Consolas"/>
-          <w:color w:val="2D3A32"/>
-          <w:sz w:val="17"/>
-        </w:rPr>
         <w:br/>
         <w:t xml:space="preserve">  views/</w:t>
-      </w:r>
-      <w:r>
-        <w:rPr>
-          <w:rFonts w:ascii="Consolas" w:hAnsi="Consolas"/>
-          <w:color w:val="2D3A32"/>
-          <w:sz w:val="17"/>
-        </w:rPr>
         <w:br/>
         <w:t xml:space="preserve">    layouts/app.blade.php</w:t>
-      </w:r>
-      <w:r>
-        <w:rPr>
-          <w:rFonts w:ascii="Consolas" w:hAnsi="Consolas"/>
-          <w:color w:val="2D3A32"/>
-          <w:sz w:val="17"/>
-        </w:rPr>
         <w:br/>
         <w:t xml:space="preserve">    dashboard.blade.php</w:t>
-      </w:r>
-      <w:r>
-        <w:rPr>
-          <w:rFonts w:ascii="Consolas" w:hAnsi="Consolas"/>
-          <w:color w:val="2D3A32"/>
-          <w:sz w:val="17"/>
-        </w:rPr>
         <w:br/>
         <w:t xml:space="preserve">    routes/</w:t>
-      </w:r>
-      <w:r>
-        <w:rPr>
-          <w:rFonts w:ascii="Consolas" w:hAnsi="Consolas"/>
-          <w:color w:val="2D3A32"/>
-          <w:sz w:val="17"/>
-        </w:rPr>
         <w:br/>
         <w:t xml:space="preserve">      index.blade.php</w:t>
-      </w:r>
-      <w:r>
-        <w:rPr>
-          <w:rFonts w:ascii="Consolas" w:hAnsi="Consolas"/>
-          <w:color w:val="2D3A32"/>
-          <w:sz w:val="17"/>
-        </w:rPr>
         <w:br/>
         <w:t xml:space="preserve">      editor.blade.php</w:t>
-      </w:r>
-      <w:r>
-        <w:rPr>
-          <w:rFonts w:ascii="Consolas" w:hAnsi="Consolas"/>
-          <w:color w:val="2D3A32"/>
-          <w:sz w:val="17"/>
-        </w:rPr>
         <w:br/>
         <w:t xml:space="preserve">      show.blade.php</w:t>
-      </w:r>
-      <w:r>
-        <w:rPr>
-          <w:rFonts w:ascii="Consolas" w:hAnsi="Consolas"/>
-          <w:color w:val="2D3A32"/>
-          <w:sz w:val="17"/>
-        </w:rPr>
         <w:br/>
         <w:t xml:space="preserve">  js/</w:t>
-      </w:r>
-      <w:r>
-        <w:rPr>
-          <w:rFonts w:ascii="Consolas" w:hAnsi="Consolas"/>
-          <w:color w:val="2D3A32"/>
-          <w:sz w:val="17"/>
-        </w:rPr>
         <w:br/>
         <w:t xml:space="preserve">    route-editor.js</w:t>
-      </w:r>
-      <w:r>
-        <w:rPr>
-          <w:rFonts w:ascii="Consolas" w:hAnsi="Consolas"/>
-          <w:color w:val="2D3A32"/>
-          <w:sz w:val="17"/>
-        </w:rPr>
-        <w:br/>
-        <w:t xml:space="preserve">    route-map.js</w:t>
-      </w:r>
-      <w:r>
-        <w:rPr>
-          <w:rFonts w:ascii="Consolas" w:hAnsi="Consolas"/>
-          <w:color w:val="2D3A32"/>
-          <w:sz w:val="17"/>
-        </w:rPr>
         <w:br/>
         <w:t>routes/web.php</w:t>
-      </w:r>
-      <w:r>
-        <w:rPr>
-          <w:rFonts w:ascii="Consolas" w:hAnsi="Consolas"/>
-          <w:color w:val="2D3A32"/>
-          <w:sz w:val="17"/>
-        </w:rPr>
         <w:br/>
         <w:t>database/migrations/</w:t>
       </w:r>
@@ -2278,7 +2097,7 @@
         </w:rPr>
       </w:pPr>
       <w:r>
-        <w:t>RouteController.php mengelola daftar, detail, pembuatan, dan perubahan rute.</w:t>
+        <w:t>RouteController.php mengelola daftar, detail, pembuatan, dan perubahan rute serta menyimpan geometri track.</w:t>
       </w:r>
     </w:p>
     <w:p>
@@ -2291,7 +2110,7 @@
         </w:rPr>
       </w:pPr>
       <w:r>
-        <w:t>GpxExportController.php menangani permintaan unduh dan header file ekspor.</w:t>
+        <w:t>RouteGpxExportController.php membentuk GPX dari track, elevasi yang tersedia, waypoint manual, dan checkpoint otomatis; controller ini mengatur unduhan file.</w:t>
       </w:r>
     </w:p>
     <w:p>
@@ -2304,7 +2123,7 @@
         </w:rPr>
       </w:pPr>
       <w:r>
-        <w:t>GpxExporter.php menyusun XML GPX dari titik rute dan metadata yang valid.</w:t>
+        <w:t>RouteWaypointController.php menangani CRUD waypoint pada rute tersimpan; jarak waypoint dihitung dari posisi terdekat pada track.</w:t>
       </w:r>
     </w:p>
     <w:p>
@@ -2317,7 +2136,7 @@
         </w:rPr>
       </w:pPr>
       <w:r>
-        <w:t>RouteAnalyzer.php menghitung jarak dan ringkasan rute; analisis elevasi ditambahkan jika sumber datanya tersedia.</w:t>
+        <w:t>RouteGeometryService.php memproyeksikan waypoint ke segmen track untuk menghitung jarak kumulatif. CheckpointGenerator.php menghitung checkpoint 5 km dan finis tanpa menyimpan checkpoint turunan ke database.</w:t>
       </w:r>
     </w:p>
     <w:p>
@@ -2330,7 +2149,7 @@
         </w:rPr>
       </w:pPr>
       <w:r>
-        <w:t>StoreRouteRequest.php dan UpdateRouteRequest.php memvalidasi nama, koordinat, serta input rute.</w:t>
+        <w:t>RouteController memvalidasi nama, koordinat, dan input rute sebelum transaksi penyimpanan.</w:t>
       </w:r>
     </w:p>
     <w:p>
@@ -2343,7 +2162,7 @@
         </w:rPr>
       </w:pPr>
       <w:r>
-        <w:t>route-editor.js dan route-map.js menangani interaksi peta dan pengiriman titik rute ke backend.</w:t>
+        <w:t>route-editor.js menangani interaksi peta, checkpoint, waypoint, dan pengiriman perubahan ke backend.</w:t>
       </w:r>
     </w:p>
     <w:p>
@@ -2578,7 +2397,7 @@
         </w:rPr>
       </w:pPr>
       <w:r>
-        <w:t>distance_from_start_meters — jarak kumulatif, dapat dihitung atau disimpan.</w:t>
+        <w:t>distance_from_start_meters – jarak kumulatif hasil hitung dari awal track, disimpan dalam meter.</w:t>
       </w:r>
     </w:p>
     <w:p>
@@ -2608,6 +2427,30 @@
       </w:r>
     </w:p>
     <w:p>
+      <w:pPr/>
+      <w:r>
+        <w:t>route_control_points (titik kontrol untuk mengedit rute)</w:t>
+      </w:r>
+    </w:p>
+    <w:p>
+      <w:pPr/>
+      <w:r>
+        <w:t>id – primary key; route_id – foreign key ke routes.</w:t>
+      </w:r>
+    </w:p>
+    <w:p>
+      <w:pPr/>
+      <w:r>
+        <w:t>sequence, latitude, longitude – urutan dan koordinat titik kontrol.</w:t>
+      </w:r>
+    </w:p>
+    <w:p>
+      <w:pPr/>
+      <w:r>
+        <w:t>timestamps – waktu pembuatan dan perubahan.</w:t>
+      </w:r>
+    </w:p>
+    <w:p>
       <w:pPr>
         <w:pStyle w:val="Heading2"/>
         <w:jc w:val="both"/>
@@ -2704,7 +2547,7 @@
         </w:rPr>
       </w:pPr>
       <w:r>
-        <w:t>waypoint_type — misalnya water refill, food stop, turnaround, exit point, atau pickup point.</w:t>
+        <w:t>waypoint_type – salah satu dari water_refill (Water station), checkpoint (Checkpoint), atau food_stop (Food station).</w:t>
       </w:r>
     </w:p>
     <w:p>
@@ -2739,98 +2582,7 @@
         <w:jc w:val="both"/>
       </w:pPr>
       <w:r>
-        <w:t>checkpoints (Fase 2)</w:t>
-      </w:r>
-    </w:p>
-    <w:p>
-      <w:pPr>
-        <w:pStyle w:val="ListBullet"/>
-        <w:keepLines/>
-        <w:jc w:val="both"/>
-        <w:rPr>
-          <w:rFonts w:hint="eastAsia"/>
-        </w:rPr>
-      </w:pPr>
-      <w:r>
-        <w:t>id — primary key.</w:t>
-      </w:r>
-    </w:p>
-    <w:p>
-      <w:pPr>
-        <w:pStyle w:val="ListBullet"/>
-        <w:keepLines/>
-        <w:jc w:val="both"/>
-        <w:rPr>
-          <w:rFonts w:hint="eastAsia"/>
-        </w:rPr>
-      </w:pPr>
-      <w:r>
-        <w:t>route_id — foreign key ke routes.</w:t>
-      </w:r>
-    </w:p>
-    <w:p>
-      <w:pPr>
-        <w:pStyle w:val="ListBullet"/>
-        <w:keepLines/>
-        <w:jc w:val="both"/>
-        <w:rPr>
-          <w:rFonts w:hint="eastAsia"/>
-        </w:rPr>
-      </w:pPr>
-      <w:r>
-        <w:t>sequence dan distance_meters — urutan serta posisi checkpoint.</w:t>
-      </w:r>
-    </w:p>
-    <w:p>
-      <w:pPr>
-        <w:pStyle w:val="ListBullet"/>
-        <w:keepLines/>
-        <w:jc w:val="both"/>
-        <w:rPr>
-          <w:rFonts w:hint="eastAsia"/>
-        </w:rPr>
-      </w:pPr>
-      <w:r>
-        <w:t>latitude, longitude, dan elevation_meters — lokasi; elevasi nullable.</w:t>
-      </w:r>
-    </w:p>
-    <w:p>
-      <w:pPr>
-        <w:pStyle w:val="ListBullet"/>
-        <w:keepLines/>
-        <w:jc w:val="both"/>
-        <w:rPr>
-          <w:rFonts w:hint="eastAsia"/>
-        </w:rPr>
-      </w:pPr>
-      <w:r>
-        <w:t>checkpoint_type — checkpoint otomatis atau tipe titik yang dipilih pengguna.</w:t>
-      </w:r>
-    </w:p>
-    <w:p>
-      <w:pPr>
-        <w:pStyle w:val="ListBullet"/>
-        <w:keepLines/>
-        <w:jc w:val="both"/>
-        <w:rPr>
-          <w:rFonts w:hint="eastAsia"/>
-        </w:rPr>
-      </w:pPr>
-      <w:r>
-        <w:t>stop_minutes dan notes — pengaturan berhenti dan catatan, bila diperlukan.</w:t>
-      </w:r>
-    </w:p>
-    <w:p>
-      <w:pPr>
-        <w:pStyle w:val="ListBullet"/>
-        <w:keepLines/>
-        <w:jc w:val="both"/>
-        <w:rPr>
-          <w:rFonts w:hint="eastAsia"/>
-        </w:rPr>
-      </w:pPr>
-      <w:r>
-        <w:t>timestamps — waktu pembuatan dan perubahan.</w:t>
+        <w:t>Checkpoint otomatis (Fase 2): tidak disimpan sebagai tabel atau model tersendiri. Checkpoint 5 km dan finis dihitung saat detail rute/ekspor diminta, lalu lokasinya diinterpolasi pada segmen track yang tersambung. Jika Fase 3 memerlukan ETA atau durasi berhenti per checkpoint yang dapat diedit, tinjau kembali kebutuhan penyimpanan terpisah.</w:t>
       </w:r>
     </w:p>
     <w:p>

</xml_diff>